<commit_message>
Regenerate ripas anketa_RIPAS.docx - full template
</commit_message>
<xml_diff>
--- a/clients/ripas/anketa_RIPAS.docx
+++ b/clients/ripas/anketa_RIPAS.docx
@@ -8,14 +8,37 @@
       </w:pPr>
       <w:r>
         <w:rPr>
+          <w:rFonts w:ascii="Times New Roman" w:hAnsi="Times New Roman"/>
+          <w:b/>
+          <w:sz w:val="22"/>
+        </w:rPr>
+        <w:t>КОНСАЛТИНГОВАЯ КОМПАНИЯ</w:t>
+        <w:br/>
+        <w:t>ANDROMEDA CONSULT</w:t>
+      </w:r>
+    </w:p>
+    <w:p>
+      <w:pPr>
+        <w:jc w:val="right"/>
+      </w:pPr>
+      <w:r>
+        <w:rPr>
+          <w:rFonts w:ascii="Times New Roman" w:hAnsi="Times New Roman"/>
           <w:color w:val="667788"/>
           <w:sz w:val="16"/>
         </w:rPr>
-        <w:t>КОНСАЛТИНГОВАЯ КОМПАНИЯ ANDROMEDA CONSULT</w:t>
+        <w:t>ИНН 7702464831  |  ОГРН 1197746181038  |  КПП 770201001</w:t>
         <w:br/>
-        <w:t>ИНН 7702464831 | ОГРН 1197746181038 | КПП 770201001</w:t>
-        <w:br/>
-        <w:t>info@andromedaconsult.ru | andromedaconsult.ru</w:t>
+        <w:t>info@andromedaconsult.ru  |  andromedaconsult.ru  |  @andromedaconsult</w:t>
+      </w:r>
+    </w:p>
+    <w:p>
+      <w:r>
+        <w:rPr>
+          <w:color w:val="CCCCCC"/>
+          <w:sz w:val="12"/>
+        </w:rPr>
+        <w:t>────────────────────────────────────────────────────────────────────────────────</w:t>
       </w:r>
     </w:p>
     <w:p>
@@ -24,10 +47,12 @@
       </w:pPr>
       <w:r>
         <w:rPr>
+          <w:rFonts w:ascii="Times New Roman" w:hAnsi="Times New Roman"/>
           <w:b/>
           <w:sz w:val="28"/>
         </w:rPr>
-        <w:t>АНКЕТА КОМПАНИИ</w:t>
+        <w:br/>
+        <w:t>АНКЕТА ДЛЯ ЗАЯВКИ В СКОЛКОВО</w:t>
       </w:r>
     </w:p>
     <w:p>
@@ -36,317 +61,632 @@
       </w:pPr>
       <w:r>
         <w:rPr>
-          <w:sz w:val="20"/>
+          <w:rFonts w:ascii="Times New Roman" w:hAnsi="Times New Roman"/>
+          <w:b/>
+          <w:sz w:val="22"/>
         </w:rPr>
-        <w:t>для оценки возможности получения статуса резидента Фонда «Сколково»</w:t>
+        <w:t>ООО «Рипас СПБ» (ИНН 7838073847)</w:t>
       </w:r>
     </w:p>
-    <w:p/>
     <w:p>
+      <w:pPr>
+        <w:jc w:val="center"/>
+      </w:pPr>
       <w:r>
         <w:rPr>
-          <w:b/>
-          <w:sz w:val="20"/>
+          <w:rFonts w:ascii="Times New Roman" w:hAnsi="Times New Roman"/>
+          <w:sz w:val="18"/>
         </w:rPr>
-        <w:t xml:space="preserve">Полное наименование: </w:t>
-      </w:r>
-      <w:r>
-        <w:rPr>
-          <w:color w:val="2ECC71"/>
-          <w:sz w:val="20"/>
-        </w:rPr>
-        <w:t>ООО «РИПАС СПБ»</w:t>
+        <w:t>Предварительно заполнено на основе открытых источников</w:t>
       </w:r>
     </w:p>
     <w:p>
       <w:r>
         <w:rPr>
-          <w:b/>
-          <w:sz w:val="20"/>
+          <w:color w:val="CCCCCC"/>
+          <w:sz w:val="12"/>
         </w:rPr>
-        <w:t xml:space="preserve">ИНН: </w:t>
+        <w:t>────────────────────────────────────────────────────────────────────────────────</w:t>
       </w:r>
+    </w:p>
+    <w:p>
+      <w:pPr>
+        <w:spacing w:after="40"/>
+      </w:pPr>
       <w:r>
         <w:rPr>
-          <w:color w:val="2ECC71"/>
-          <w:sz w:val="20"/>
+          <w:rFonts w:ascii="Times New Roman" w:hAnsi="Times New Roman"/>
+          <w:sz w:val="18"/>
         </w:rPr>
-        <w:t>7802873877</w:t>
+        <w:t>Условные обозначения: 🟢 — данные из открытых источников  |  🟡 — гипотезы (требуют подтверждения)  |  🔴 — данные отсутствуют</w:t>
       </w:r>
     </w:p>
     <w:p>
       <w:r>
         <w:rPr>
+          <w:rFonts w:ascii="Times New Roman" w:hAnsi="Times New Roman"/>
+          <w:b/>
+          <w:sz w:val="24"/>
+        </w:rPr>
+        <w:br/>
+        <w:t>1. Данные от личного кабинета (lk.sk.ru)</w:t>
+      </w:r>
+    </w:p>
+    <w:p>
+      <w:pPr>
+        <w:spacing w:after="40"/>
+      </w:pPr>
+      <w:r>
+        <w:rPr>
+          <w:rFonts w:ascii="Times New Roman" w:hAnsi="Times New Roman"/>
           <w:b/>
           <w:sz w:val="20"/>
         </w:rPr>
-        <w:t xml:space="preserve">ОГРН: </w:t>
+        <w:t xml:space="preserve">🔴 Данные личного кабинета: </w:t>
       </w:r>
       <w:r>
         <w:rPr>
-          <w:color w:val="2ECC71"/>
+          <w:rFonts w:ascii="Times New Roman" w:hAnsi="Times New Roman"/>
+          <w:color w:val="CC3333"/>
           <w:sz w:val="20"/>
         </w:rPr>
-        <w:t>1147847357261</w:t>
+        <w:t>Не получены. Требуется регистрация на lk.sk.ru</w:t>
       </w:r>
     </w:p>
     <w:p>
       <w:r>
         <w:rPr>
+          <w:rFonts w:ascii="Times New Roman" w:hAnsi="Times New Roman"/>
+          <w:b/>
+          <w:sz w:val="24"/>
+        </w:rPr>
+        <w:br/>
+        <w:t>2. Информация о компании</w:t>
+      </w:r>
+    </w:p>
+    <w:p>
+      <w:pPr>
+        <w:spacing w:after="40"/>
+      </w:pPr>
+      <w:r>
+        <w:rPr>
+          <w:rFonts w:ascii="Times New Roman" w:hAnsi="Times New Roman"/>
           <w:b/>
           <w:sz w:val="20"/>
         </w:rPr>
-        <w:t xml:space="preserve">Дата регистрации: </w:t>
+        <w:t xml:space="preserve">🟢 Полное наименование: </w:t>
       </w:r>
       <w:r>
         <w:rPr>
-          <w:color w:val="2ECC71"/>
+          <w:rFonts w:ascii="Times New Roman" w:hAnsi="Times New Roman"/>
           <w:sz w:val="20"/>
         </w:rPr>
-        <w:t>14.10.2014</w:t>
+        <w:t>ОБЩЕСТВО С ОГРАНИЧЕННОЙ ОТВЕТСТВЕННОСТЬЮ «РИПАС СПБ»</w:t>
+      </w:r>
+    </w:p>
+    <w:p>
+      <w:pPr>
+        <w:spacing w:after="40"/>
+      </w:pPr>
+      <w:r>
+        <w:rPr>
+          <w:rFonts w:ascii="Times New Roman" w:hAnsi="Times New Roman"/>
+          <w:b/>
+          <w:sz w:val="20"/>
+        </w:rPr>
+        <w:t xml:space="preserve">🟢 ИНН: </w:t>
+      </w:r>
+      <w:r>
+        <w:rPr>
+          <w:rFonts w:ascii="Times New Roman" w:hAnsi="Times New Roman"/>
+          <w:sz w:val="20"/>
+        </w:rPr>
+        <w:t>7838073847</w:t>
+      </w:r>
+    </w:p>
+    <w:p>
+      <w:pPr>
+        <w:spacing w:after="40"/>
+      </w:pPr>
+      <w:r>
+        <w:rPr>
+          <w:rFonts w:ascii="Times New Roman" w:hAnsi="Times New Roman"/>
+          <w:b/>
+          <w:sz w:val="20"/>
+        </w:rPr>
+        <w:t xml:space="preserve">🟢 ОГРН: </w:t>
+      </w:r>
+      <w:r>
+        <w:rPr>
+          <w:rFonts w:ascii="Times New Roman" w:hAnsi="Times New Roman"/>
+          <w:sz w:val="20"/>
+        </w:rPr>
+        <w:t>1177847218164</w:t>
+      </w:r>
+    </w:p>
+    <w:p>
+      <w:pPr>
+        <w:spacing w:after="40"/>
+      </w:pPr>
+      <w:r>
+        <w:rPr>
+          <w:rFonts w:ascii="Times New Roman" w:hAnsi="Times New Roman"/>
+          <w:b/>
+          <w:sz w:val="20"/>
+        </w:rPr>
+        <w:t xml:space="preserve">🟢 Дата регистрации: </w:t>
+      </w:r>
+      <w:r>
+        <w:rPr>
+          <w:rFonts w:ascii="Times New Roman" w:hAnsi="Times New Roman"/>
+          <w:sz w:val="20"/>
+        </w:rPr>
+        <w:t>2017 год</w:t>
+      </w:r>
+    </w:p>
+    <w:p>
+      <w:pPr>
+        <w:spacing w:after="40"/>
+      </w:pPr>
+      <w:r>
+        <w:rPr>
+          <w:rFonts w:ascii="Times New Roman" w:hAnsi="Times New Roman"/>
+          <w:b/>
+          <w:sz w:val="20"/>
+        </w:rPr>
+        <w:t xml:space="preserve">🟢 Юридический адрес: </w:t>
+      </w:r>
+      <w:r>
+        <w:rPr>
+          <w:rFonts w:ascii="Times New Roman" w:hAnsi="Times New Roman"/>
+          <w:sz w:val="20"/>
+        </w:rPr>
+        <w:t>196240, г. Санкт-Петербург, ул. Варшавская, д. 68, лит. А, пом. 1-Н</w:t>
+      </w:r>
+    </w:p>
+    <w:p>
+      <w:pPr>
+        <w:spacing w:after="40"/>
+      </w:pPr>
+      <w:r>
+        <w:rPr>
+          <w:rFonts w:ascii="Times New Roman" w:hAnsi="Times New Roman"/>
+          <w:b/>
+          <w:sz w:val="20"/>
+        </w:rPr>
+        <w:t xml:space="preserve">🟢 Руководитель: </w:t>
+      </w:r>
+      <w:r>
+        <w:rPr>
+          <w:rFonts w:ascii="Times New Roman" w:hAnsi="Times New Roman"/>
+          <w:sz w:val="20"/>
+        </w:rPr>
+        <w:t>Фролов Дмитрий Валерьевич</w:t>
+      </w:r>
+    </w:p>
+    <w:p>
+      <w:pPr>
+        <w:spacing w:after="40"/>
+      </w:pPr>
+      <w:r>
+        <w:rPr>
+          <w:rFonts w:ascii="Times New Roman" w:hAnsi="Times New Roman"/>
+          <w:b/>
+          <w:sz w:val="20"/>
+        </w:rPr>
+        <w:t xml:space="preserve">🟢 ОКВЭД основной: </w:t>
+      </w:r>
+      <w:r>
+        <w:rPr>
+          <w:rFonts w:ascii="Times New Roman" w:hAnsi="Times New Roman"/>
+          <w:sz w:val="20"/>
+        </w:rPr>
+        <w:t>20.42 — Производство парфюмерных и косметических средств</w:t>
+      </w:r>
+    </w:p>
+    <w:p>
+      <w:pPr>
+        <w:spacing w:after="40"/>
+      </w:pPr>
+      <w:r>
+        <w:rPr>
+          <w:rFonts w:ascii="Times New Roman" w:hAnsi="Times New Roman"/>
+          <w:b/>
+          <w:sz w:val="20"/>
+        </w:rPr>
+        <w:t xml:space="preserve">🟡 ОКВЭД 72 (для Сколково): </w:t>
+      </w:r>
+      <w:r>
+        <w:rPr>
+          <w:rFonts w:ascii="Times New Roman" w:hAnsi="Times New Roman"/>
+          <w:color w:val="CC8800"/>
+          <w:sz w:val="20"/>
+        </w:rPr>
+        <w:t>Не внесён. Требуется внесение изменений в ЕГРЮЛ или создание нового юрлица</w:t>
+      </w:r>
+    </w:p>
+    <w:p>
+      <w:pPr>
+        <w:spacing w:after="40"/>
+      </w:pPr>
+      <w:r>
+        <w:rPr>
+          <w:rFonts w:ascii="Times New Roman" w:hAnsi="Times New Roman"/>
+          <w:b/>
+          <w:sz w:val="20"/>
+        </w:rPr>
+        <w:t xml:space="preserve">🟢 Сотрудники: </w:t>
+      </w:r>
+      <w:r>
+        <w:rPr>
+          <w:rFonts w:ascii="Times New Roman" w:hAnsi="Times New Roman"/>
+          <w:sz w:val="20"/>
+        </w:rPr>
+        <w:t>~25 чел.</w:t>
+      </w:r>
+    </w:p>
+    <w:p>
+      <w:pPr>
+        <w:spacing w:after="40"/>
+      </w:pPr>
+      <w:r>
+        <w:rPr>
+          <w:rFonts w:ascii="Times New Roman" w:hAnsi="Times New Roman"/>
+          <w:b/>
+          <w:sz w:val="20"/>
+        </w:rPr>
+        <w:t xml:space="preserve">🟢 Выручка 2025: </w:t>
+      </w:r>
+      <w:r>
+        <w:rPr>
+          <w:rFonts w:ascii="Times New Roman" w:hAnsi="Times New Roman"/>
+          <w:sz w:val="20"/>
+        </w:rPr>
+        <w:t>429,1 млн ₽</w:t>
+      </w:r>
+    </w:p>
+    <w:p>
+      <w:pPr>
+        <w:spacing w:after="40"/>
+      </w:pPr>
+      <w:r>
+        <w:rPr>
+          <w:rFonts w:ascii="Times New Roman" w:hAnsi="Times New Roman"/>
+          <w:b/>
+          <w:sz w:val="20"/>
+        </w:rPr>
+        <w:t xml:space="preserve">🟢 Прибыль 2025: </w:t>
+      </w:r>
+      <w:r>
+        <w:rPr>
+          <w:rFonts w:ascii="Times New Roman" w:hAnsi="Times New Roman"/>
+          <w:sz w:val="20"/>
+        </w:rPr>
+        <w:t>19,0 млн ₽</w:t>
+      </w:r>
+    </w:p>
+    <w:p>
+      <w:pPr>
+        <w:spacing w:after="40"/>
+      </w:pPr>
+      <w:r>
+        <w:rPr>
+          <w:rFonts w:ascii="Times New Roman" w:hAnsi="Times New Roman"/>
+          <w:b/>
+          <w:sz w:val="20"/>
+        </w:rPr>
+        <w:t xml:space="preserve">🟡 Контактные телефоны/Email: </w:t>
+      </w:r>
+      <w:r>
+        <w:rPr>
+          <w:rFonts w:ascii="Times New Roman" w:hAnsi="Times New Roman"/>
+          <w:color w:val="CC8800"/>
+          <w:sz w:val="20"/>
+        </w:rPr>
+        <w:t>Требуется уточнить у клиента</w:t>
+      </w:r>
+    </w:p>
+    <w:p>
+      <w:pPr>
+        <w:spacing w:after="40"/>
+      </w:pPr>
+      <w:r>
+        <w:rPr>
+          <w:rFonts w:ascii="Times New Roman" w:hAnsi="Times New Roman"/>
+          <w:b/>
+          <w:sz w:val="20"/>
+        </w:rPr>
+        <w:t xml:space="preserve">🔴 Сайт компании: </w:t>
+      </w:r>
+      <w:r>
+        <w:rPr>
+          <w:rFonts w:ascii="Times New Roman" w:hAnsi="Times New Roman"/>
+          <w:color w:val="CC3333"/>
+          <w:sz w:val="20"/>
+        </w:rPr>
+        <w:t>Не найден</w:t>
       </w:r>
     </w:p>
     <w:p>
       <w:r>
         <w:rPr>
+          <w:rFonts w:ascii="Times New Roman" w:hAnsi="Times New Roman"/>
+          <w:b/>
+          <w:sz w:val="24"/>
+        </w:rPr>
+        <w:br/>
+        <w:t>3. Научно-технический критерий</w:t>
+      </w:r>
+    </w:p>
+    <w:p>
+      <w:pPr>
+        <w:spacing w:after="40"/>
+      </w:pPr>
+      <w:r>
+        <w:rPr>
+          <w:rFonts w:ascii="Times New Roman" w:hAnsi="Times New Roman"/>
           <w:b/>
           <w:sz w:val="20"/>
         </w:rPr>
-        <w:t xml:space="preserve">Руководитель: </w:t>
+        <w:t xml:space="preserve">🟡 Гипотеза по продукту-инновации: </w:t>
       </w:r>
       <w:r>
         <w:rPr>
-          <w:color w:val="2ECC71"/>
+          <w:rFonts w:ascii="Times New Roman" w:hAnsi="Times New Roman"/>
+          <w:color w:val="CC8800"/>
           <w:sz w:val="20"/>
         </w:rPr>
-        <w:t>Корнюкова Светлана Ефимовна (генеральный директор)</w:t>
+        <w:t>Разработка инновационных косметических средств с использованием новых рецептур и технологий</w:t>
+      </w:r>
+    </w:p>
+    <w:p>
+      <w:pPr>
+        <w:spacing w:after="40"/>
+      </w:pPr>
+      <w:r>
+        <w:rPr>
+          <w:rFonts w:ascii="Times New Roman" w:hAnsi="Times New Roman"/>
+          <w:b/>
+          <w:sz w:val="20"/>
+        </w:rPr>
+        <w:t xml:space="preserve">🟡 Направления инновации: </w:t>
+      </w:r>
+      <w:r>
+        <w:rPr>
+          <w:rFonts w:ascii="Times New Roman" w:hAnsi="Times New Roman"/>
+          <w:color w:val="CC8800"/>
+          <w:sz w:val="20"/>
+        </w:rPr>
+        <w:t>Косметическая химия, рецептуры, контроль качества</w:t>
+      </w:r>
+    </w:p>
+    <w:p>
+      <w:pPr>
+        <w:spacing w:after="40"/>
+      </w:pPr>
+      <w:r>
+        <w:rPr>
+          <w:rFonts w:ascii="Times New Roman" w:hAnsi="Times New Roman"/>
+          <w:b/>
+          <w:sz w:val="20"/>
+        </w:rPr>
+        <w:t xml:space="preserve">🟡 Патенты / заявки на ИС: </w:t>
+      </w:r>
+      <w:r>
+        <w:rPr>
+          <w:rFonts w:ascii="Times New Roman" w:hAnsi="Times New Roman"/>
+          <w:color w:val="CC8800"/>
+          <w:sz w:val="20"/>
+        </w:rPr>
+        <w:t>Не найдены</w:t>
+      </w:r>
+    </w:p>
+    <w:p>
+      <w:pPr>
+        <w:spacing w:after="40"/>
+      </w:pPr>
+      <w:r>
+        <w:rPr>
+          <w:rFonts w:ascii="Times New Roman" w:hAnsi="Times New Roman"/>
+          <w:b/>
+          <w:sz w:val="20"/>
+        </w:rPr>
+        <w:t xml:space="preserve">🔴 Научные публикации: </w:t>
+      </w:r>
+      <w:r>
+        <w:rPr>
+          <w:rFonts w:ascii="Times New Roman" w:hAnsi="Times New Roman"/>
+          <w:color w:val="CC3333"/>
+          <w:sz w:val="20"/>
+        </w:rPr>
+        <w:t>Не найдены</w:t>
       </w:r>
     </w:p>
     <w:p>
       <w:r>
         <w:rPr>
+          <w:rFonts w:ascii="Times New Roman" w:hAnsi="Times New Roman"/>
+          <w:b/>
+          <w:sz w:val="24"/>
+        </w:rPr>
+        <w:br/>
+        <w:t>4. Критерий материально-технической базы</w:t>
+      </w:r>
+    </w:p>
+    <w:p>
+      <w:pPr>
+        <w:spacing w:after="40"/>
+      </w:pPr>
+      <w:r>
+        <w:rPr>
+          <w:rFonts w:ascii="Times New Roman" w:hAnsi="Times New Roman"/>
           <w:b/>
           <w:sz w:val="20"/>
         </w:rPr>
-        <w:t xml:space="preserve">Учредитель: </w:t>
+        <w:t xml:space="preserve">🟢 Персонал: </w:t>
       </w:r>
       <w:r>
         <w:rPr>
-          <w:color w:val="2ECC71"/>
+          <w:rFonts w:ascii="Times New Roman" w:hAnsi="Times New Roman"/>
           <w:sz w:val="20"/>
         </w:rPr>
-        <w:t>Корнюкова Светлана Ефимовна (100%)</w:t>
+        <w:t>~25 чел. сотрудников</w:t>
+      </w:r>
+    </w:p>
+    <w:p>
+      <w:pPr>
+        <w:spacing w:after="40"/>
+      </w:pPr>
+      <w:r>
+        <w:rPr>
+          <w:rFonts w:ascii="Times New Roman" w:hAnsi="Times New Roman"/>
+          <w:b/>
+          <w:sz w:val="20"/>
+        </w:rPr>
+        <w:t xml:space="preserve">🟡 Производственная база: </w:t>
+      </w:r>
+      <w:r>
+        <w:rPr>
+          <w:rFonts w:ascii="Times New Roman" w:hAnsi="Times New Roman"/>
+          <w:color w:val="CC8800"/>
+          <w:sz w:val="20"/>
+        </w:rPr>
+        <w:t>Подтверждено — наличие производства</w:t>
       </w:r>
     </w:p>
     <w:p>
       <w:r>
         <w:rPr>
+          <w:rFonts w:ascii="Times New Roman" w:hAnsi="Times New Roman"/>
+          <w:b/>
+          <w:sz w:val="24"/>
+        </w:rPr>
+        <w:br/>
+        <w:t>5. Научно-техническая анкета (НИОКР)</w:t>
+      </w:r>
+    </w:p>
+    <w:p>
+      <w:pPr>
+        <w:spacing w:after="40"/>
+      </w:pPr>
+      <w:r>
+        <w:rPr>
+          <w:rFonts w:ascii="Times New Roman" w:hAnsi="Times New Roman"/>
           <w:b/>
           <w:sz w:val="20"/>
         </w:rPr>
-        <w:t xml:space="preserve">Юридический адрес: </w:t>
+        <w:t xml:space="preserve">🔴 Требуется заполнение: </w:t>
       </w:r>
       <w:r>
         <w:rPr>
-          <w:color w:val="2ECC71"/>
+          <w:rFonts w:ascii="Times New Roman" w:hAnsi="Times New Roman"/>
+          <w:color w:val="CC3333"/>
           <w:sz w:val="20"/>
         </w:rPr>
-        <w:t>194156, г. Санкт-Петербург, пр-кт Энгельса, д. 27, к. 5, лит. А, оф. 321</w:t>
+        <w:t>Совместно с клиентом: описание технологии, инновации, ТТХ, смета, календарный план</w:t>
       </w:r>
     </w:p>
     <w:p>
       <w:r>
         <w:rPr>
+          <w:rFonts w:ascii="Times New Roman" w:hAnsi="Times New Roman"/>
+          <w:b/>
+          <w:sz w:val="24"/>
+        </w:rPr>
+        <w:br/>
+        <w:t>6. Проект технического задания на выполнение НИОКР</w:t>
+      </w:r>
+    </w:p>
+    <w:p>
+      <w:pPr>
+        <w:spacing w:after="40"/>
+      </w:pPr>
+      <w:r>
+        <w:rPr>
+          <w:rFonts w:ascii="Times New Roman" w:hAnsi="Times New Roman"/>
           <w:b/>
           <w:sz w:val="20"/>
         </w:rPr>
-        <w:t xml:space="preserve">Сайт: </w:t>
+        <w:t xml:space="preserve">🔴 ТЗ: </w:t>
       </w:r>
       <w:r>
         <w:rPr>
-          <w:color w:val="2ECC71"/>
+          <w:rFonts w:ascii="Times New Roman" w:hAnsi="Times New Roman"/>
+          <w:color w:val="CC3333"/>
           <w:sz w:val="20"/>
         </w:rPr>
-        <w:t>ripas.ru</w:t>
+        <w:t>Разрабатывается после согласования продукта-инновации с клиентом</w:t>
       </w:r>
     </w:p>
     <w:p>
       <w:r>
         <w:rPr>
+          <w:rFonts w:ascii="Times New Roman" w:hAnsi="Times New Roman"/>
           <w:b/>
-          <w:sz w:val="20"/>
+          <w:sz w:val="24"/>
         </w:rPr>
-        <w:t xml:space="preserve">Телефон: </w:t>
-      </w:r>
-      <w:r>
-        <w:rPr>
-          <w:color w:val="2ECC71"/>
-          <w:sz w:val="20"/>
-        </w:rPr>
-        <w:t>+7 (812) 293-25-57</w:t>
+        <w:br/>
+        <w:t>Примечания для аналитиков</w:t>
       </w:r>
     </w:p>
     <w:p>
+      <w:pPr>
+        <w:spacing w:after="40"/>
+      </w:pPr>
       <w:r>
         <w:rPr>
-          <w:b/>
+          <w:rFonts w:ascii="Times New Roman" w:hAnsi="Times New Roman"/>
           <w:sz w:val="20"/>
         </w:rPr>
-        <w:t xml:space="preserve">Электронная почта: </w:t>
-      </w:r>
-      <w:r>
-        <w:rPr>
-          <w:color w:val="2ECC71"/>
-          <w:sz w:val="20"/>
-        </w:rPr>
-        <w:t>info@ripas.ru</w:t>
+        <w:t>Патент: если у клиента нет патента — работаем с патентоведом. Заявка подаётся параллельно с заявкой в Сколково.</w:t>
       </w:r>
     </w:p>
     <w:p>
+      <w:pPr>
+        <w:spacing w:after="40"/>
+      </w:pPr>
       <w:r>
         <w:rPr>
-          <w:b/>
+          <w:rFonts w:ascii="Times New Roman" w:hAnsi="Times New Roman"/>
           <w:sz w:val="20"/>
         </w:rPr>
-        <w:t xml:space="preserve">Основной ОКВЭД: </w:t>
-      </w:r>
-      <w:r>
-        <w:rPr>
-          <w:color w:val="2ECC71"/>
-          <w:sz w:val="20"/>
-        </w:rPr>
-        <w:t>26.51.7 — Приборы и аппаратура для автоматического регулирования</w:t>
+        <w:t>Стоимость продукта и количество продаж — запрашиваются у клиента.</w:t>
       </w:r>
     </w:p>
     <w:p>
+      <w:pPr>
+        <w:spacing w:after="40"/>
+      </w:pPr>
       <w:r>
         <w:rPr>
-          <w:b/>
+          <w:rFonts w:ascii="Times New Roman" w:hAnsi="Times New Roman"/>
           <w:sz w:val="20"/>
         </w:rPr>
-        <w:t xml:space="preserve">Налоговый режим: </w:t>
-      </w:r>
-      <w:r>
-        <w:rPr>
-          <w:color w:val="2ECC71"/>
-          <w:sz w:val="20"/>
-        </w:rPr>
-        <w:t>ОСН (специальный режим не применяется)</w:t>
+        <w:t>Сайт компании не обнаружен. Рекомендовать клиенту создать минимальную страницу с описанием продукции.</w:t>
       </w:r>
     </w:p>
     <w:p>
+      <w:pPr>
+        <w:spacing w:after="40"/>
+      </w:pPr>
       <w:r>
         <w:rPr>
-          <w:b/>
+          <w:rFonts w:ascii="Times New Roman" w:hAnsi="Times New Roman"/>
           <w:sz w:val="20"/>
         </w:rPr>
-        <w:t xml:space="preserve">Выручка (2024): </w:t>
-      </w:r>
-      <w:r>
-        <w:rPr>
-          <w:color w:val="2ECC71"/>
-          <w:sz w:val="20"/>
-        </w:rPr>
-        <w:t>429 млн ₽</w:t>
+        <w:t>На весь процесс клиент тратит 3–5 рабочих дней команды.</w:t>
       </w:r>
     </w:p>
     <w:p>
+      <w:pPr>
+        <w:spacing w:after="40"/>
+      </w:pPr>
       <w:r>
         <w:rPr>
-          <w:b/>
+          <w:rFonts w:ascii="Times New Roman" w:hAnsi="Times New Roman"/>
           <w:sz w:val="20"/>
         </w:rPr>
-        <w:t xml:space="preserve">Чистая прибыль (2024): </w:t>
-      </w:r>
-      <w:r>
-        <w:rPr>
-          <w:color w:val="2ECC71"/>
-          <w:sz w:val="20"/>
-        </w:rPr>
-        <w:t>118 млн ₽</w:t>
-      </w:r>
-    </w:p>
-    <w:p>
-      <w:r>
-        <w:rPr>
-          <w:b/>
-          <w:sz w:val="20"/>
-        </w:rPr>
-        <w:t xml:space="preserve">Численность сотрудников: </w:t>
-      </w:r>
-      <w:r>
-        <w:rPr>
-          <w:color w:val="2ECC71"/>
-          <w:sz w:val="20"/>
-        </w:rPr>
-        <w:t>32 чел. (2025)</w:t>
-      </w:r>
-    </w:p>
-    <w:p>
-      <w:r>
-        <w:rPr>
-          <w:b/>
-          <w:sz w:val="20"/>
-        </w:rPr>
-        <w:t xml:space="preserve">Наличие патентов / ИС: </w:t>
-      </w:r>
-      <w:r>
-        <w:rPr>
-          <w:color w:val="F39C12"/>
-          <w:sz w:val="20"/>
-        </w:rPr>
-        <w:t>Требуется патентный аудит (гипотеза: есть ПО)</w:t>
-      </w:r>
-    </w:p>
-    <w:p>
-      <w:r>
-        <w:rPr>
-          <w:b/>
-          <w:sz w:val="20"/>
-        </w:rPr>
-        <w:t xml:space="preserve">Продукция: </w:t>
-      </w:r>
-      <w:r>
-        <w:rPr>
-          <w:color w:val="2ECC71"/>
-          <w:sz w:val="20"/>
-        </w:rPr>
-        <w:t>Дорожные контроллеры, видеодетекторы, АСУДД «СПЕКТР», V2X</w:t>
-      </w:r>
-    </w:p>
-    <w:p>
-      <w:r>
-        <w:rPr>
-          <w:b/>
-          <w:sz w:val="20"/>
-        </w:rPr>
-        <w:t xml:space="preserve">Связанные компании: </w:t>
-      </w:r>
-      <w:r>
-        <w:rPr>
-          <w:color w:val="F39C12"/>
-          <w:sz w:val="20"/>
-        </w:rPr>
-        <w:t>Требуется уточнение</w:t>
-      </w:r>
-    </w:p>
-    <w:p/>
-    <w:p>
-      <w:r>
-        <w:rPr>
-          <w:b/>
-          <w:sz w:val="20"/>
-        </w:rPr>
-        <w:t>Гипотеза по инновации:</w:t>
-      </w:r>
-    </w:p>
-    <w:p>
-      <w:r>
-        <w:rPr>
-          <w:color w:val="2ECC71"/>
-          <w:sz w:val="20"/>
-        </w:rPr>
-        <w:t>Компания разрабатывает и производит «интеллектуальные» транспортные системы: программно-аппаратный комплекс АСУДД «СПЕКТР», V2X-решения для взаимодействия инфраструктуры с транспортом, видеодетекторы. Инновационная составляющая очевидна — собственные разработки ПО и оборудования для «умного города».</w:t>
+        <w:t>Рекомендуемая инновация — разработка инновационных косметических средств с использованием новых рецептур и технологий.</w:t>
       </w:r>
     </w:p>
     <w:sectPr>
@@ -722,6 +1062,9 @@
     <w:name w:val="Normal"/>
     <w:qFormat/>
     <w:rsid w:val="00FC693F"/>
+    <w:pPr>
+      <w:spacing w:line="276" w:lineRule="auto"/>
+    </w:pPr>
     <w:rPr>
       <w:rFonts w:ascii="Times New Roman" w:hAnsi="Times New Roman"/>
       <w:sz w:val="22"/>

</xml_diff>